<commit_message>
Clarify provenance: BF/BER are new metrics of this work; empirical calibration attributed to Schuemie et al.
- Manuscripts + supplements: explicit origin-attribution sentences at definition,
  relationship-to-existing-approaches, discussion, and data-sharing sections
- Boundary sentences: EmpiricalCalibration package does not include BF or BER
- Cover letter: provenance paragraph; terminology unified (mixed zone)
- Simulator (zh/en): provenance in hero, badges, animations B/D, metric dictionary,
  glossary (new EmpiricalCalibration entry), footer
- README: metric introduction section strengthened
</commit_message>
<xml_diff>
--- a/paper/manuscript_jama_v35.docx
+++ b/paper/manuscript_jama_v35.docx
@@ -189,7 +189,7 @@
         <w:t xml:space="preserve"> </w:t>
       </w:r>
       <w:r>
-        <w:t xml:space="preserve">The MIMIC-IV database (v2.2) is available through PhysioNet (https://physionet.org/content/mimiciv/) and the MIMIC-IV-ECG extension (v1.0.1) at (https://physionet.org/content/mimic-iv-ecg/1.0.1/) to credentialed users. All analysis code is available at https://github.com/zengzhechun/bias-fraction.</w:t>
+        <w:t xml:space="preserve">The MIMIC-IV database (v2.2) is available through PhysioNet (https://physionet.org/content/mimiciv/) and the MIMIC-IV-ECG extension (v1.0.1) at (https://physionet.org/content/mimic-iv-ecg/1.0.1/) to credentialed users. All analysis code, including the BF/BER computation proposed in this work, is available at https://github.com/zengzhechun/bias-fraction. The EmpiricalCalibration R package (Schuemie et al.), which supplies the empirical null machinery used here but does not include BF or BER, is available from CRAN.</w:t>
       </w:r>
     </w:p>
     <w:p>
@@ -333,7 +333,7 @@
         <w:t xml:space="preserve">Objective</w:t>
       </w:r>
       <w:r>
-        <w:t xml:space="preserve">: To develop and evaluate the bias fraction (BF), a bounded credibility metric quantifying the share of systematic bias in a calibrated observational effect estimate.</w:t>
+        <w:t xml:space="preserve">: To develop and evaluate the bias fraction (BF), a new bounded credibility metric proposed in this work, quantifying the share of systematic bias in a calibrated observational effect estimate.</w:t>
       </w:r>
     </w:p>
     <w:p>
@@ -686,7 +686,7 @@
         <w:pStyle w:val="BodyText"/>
       </w:pPr>
       <w:r>
-        <w:t xml:space="preserve">We propose the bias fraction (BF), an empirical credibility metric derived from negative control calibration. BF reports the share of the total calibrated signal, bias plus residual effect, attributable to bias, on a bounded [0,1] scale. It is computed directly from quantities produced by the OHDSI empirical calibration pipeline using the EmpiricalCalibration R package, requiring no additional data. We develop a three-zone heuristic classification (bias-dominated, mixed, effect-dominated), assess its operating characteristics through simulation across 336 conditions, and demonstrate the approach through a TTE of beta-blocker therapy in 14,677 heart failure patients from MIMIC-IV</w:t>
+        <w:t xml:space="preserve">We propose the bias fraction (BF), a new empirical credibility metric introduced by this work that builds on, but is not part of, the OHDSI empirical calibration framework (Schuemie et al.) and its EmpiricalCalibration R package. BF reports the share of the total calibrated signal, bias plus residual effect, attributable to bias, on a bounded [0,1] scale. It is computed directly from quantities that the pre-existing calibration pipeline already produces, requiring no additional data; the metrics themselves, with the auxiliary bias-effect ratio (BER) form, are the contribution of this work. We develop a three-zone heuristic classification (bias-dominated, mixed, effect-dominated), assess its operating characteristics through simulation across 336 conditions, and demonstrate the approach through a TTE of beta-blocker therapy in 14,677 heart failure patients from MIMIC-IV</w:t>
       </w:r>
       <w:r>
         <w:rPr>
@@ -1912,7 +1912,7 @@
         </m:r>
       </m:oMath>
       <w:r>
-        <w:t xml:space="preserve">; we retain BER as an auxiliary display (eTable 1 in the Supplement).</w:t>
+        <w:t xml:space="preserve">, likewise introduced here; we retain BER as an auxiliary display (eTable 1 in the Supplement).</w:t>
       </w:r>
     </w:p>
     <w:p>
@@ -3821,7 +3821,19 @@
         <w:pStyle w:val="FirstParagraph"/>
       </w:pPr>
       <w:r>
-        <w:t xml:space="preserve">This study proposes BF, an empirical credibility metric that extends negative control calibration from a binary significance test to a bounded, continuous diagnostic. The simulation demonstrated reliable classification at the extremes (80.0% bias-dominated, 95.1% effect-dominated accuracy) but substantial instability in the mixed zone (41.8%), where the underlying ratio divides by a calibrated estimate near zero. The CI-based heuristic addresses this limitation as a selective classifier: it issued decisive calls with 86.8% accuracy, but only 47.6% of the time. The bounded scale also removes two defects of the unbounded ratio: its large upward bias under exchangeability (relative bias +137% to +319%, versus 2.1% for BF) and its infinite values at the null.</w:t>
+        <w:t xml:space="preserve">This study proposes BF, with its auxiliary BER form, as new credibility metrics. They extend the pre-existing OHDSI empirical calibration framework and EmpiricalCalibration R package</w:t>
+      </w:r>
+      <w:r>
+        <w:rPr>
+          <w:vertAlign w:val="superscript"/>
+        </w:rPr>
+        <w:t xml:space="preserve">8,9</w:t>
+      </w:r>
+      <w:r>
+        <w:t xml:space="preserve"> </w:t>
+      </w:r>
+      <w:r>
+        <w:t xml:space="preserve">from a binary significance test to a bounded, continuous diagnostic; the framework and package are prior methodology, whereas the metrics, the three-zone classification, and their evaluation are the contributions of this study. The simulation demonstrated reliable classification at the extremes (80.0% bias-dominated, 95.1% effect-dominated accuracy) but substantial instability in the mixed zone (41.8%), where the underlying ratio divides by a calibrated estimate near zero. The CI-based heuristic addresses this limitation as a selective classifier: it issued decisive calls with 86.8% accuracy, but only 47.6% of the time. The bounded scale also removes two defects of the unbounded ratio: its large upward bias under exchangeability (relative bias +137% to +319%, versus 2.1% for BF) and its infinite values at the null.</w:t>
       </w:r>
     </w:p>
     <w:p>

</xml_diff>